<commit_message>
Modification --Yunlong Wang,Computing Science,Griffith College Dublin-- 2026/7/11 22:06
</commit_message>
<xml_diff>
--- a/paper/Draft.docx
+++ b/paper/Draft.docx
@@ -3584,7 +3584,7 @@
                 <w:noProof/>
                 <w:webHidden/>
               </w:rPr>
-              <w:t>6</w:t>
+              <w:t>7</w:t>
             </w:r>
             <w:r>
               <w:rPr>
@@ -3872,7 +3872,7 @@
                 <w:noProof/>
                 <w:webHidden/>
               </w:rPr>
-              <w:t>8</w:t>
+              <w:t>9</w:t>
             </w:r>
             <w:r>
               <w:rPr>
@@ -3944,7 +3944,7 @@
                 <w:noProof/>
                 <w:webHidden/>
               </w:rPr>
-              <w:t>9</w:t>
+              <w:t>10</w:t>
             </w:r>
             <w:r>
               <w:rPr>
@@ -4232,7 +4232,7 @@
                 <w:noProof/>
                 <w:webHidden/>
               </w:rPr>
-              <w:t>12</w:t>
+              <w:t>13</w:t>
             </w:r>
             <w:r>
               <w:rPr>
@@ -4376,7 +4376,7 @@
                 <w:noProof/>
                 <w:webHidden/>
               </w:rPr>
-              <w:t>16</w:t>
+              <w:t>15</w:t>
             </w:r>
             <w:r>
               <w:rPr>
@@ -5626,7 +5626,7 @@
         </mc:Choice>
         <mc:Fallback>
           <w:pict>
-            <v:rect w14:anchorId="5DCEE237" id="矩形 222" o:spid="_x0000_s1026" style="position:absolute;left:0;text-align:left;margin-left:0;margin-top:0;width:580.8pt;height:752.4pt;z-index:251659264;visibility:visible;mso-wrap-style:square;mso-width-percent:950;mso-height-percent:950;mso-wrap-distance-left:9pt;mso-wrap-distance-top:0;mso-wrap-distance-right:9pt;mso-wrap-distance-bottom:0;mso-position-horizontal:center;mso-position-horizontal-relative:page;mso-position-vertical:center;mso-position-vertical-relative:page;mso-width-percent:950;mso-height-percent:950;mso-width-relative:page;mso-height-relative:page;v-text-anchor:middle" o:gfxdata="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" filled="f" strokecolor="#747070 [1614]" strokeweight="1.25pt">
+            <v:rect w14:anchorId="382AF3A6" id="矩形 222" o:spid="_x0000_s1026" style="position:absolute;left:0;text-align:left;margin-left:0;margin-top:0;width:580.8pt;height:752.4pt;z-index:251659264;visibility:visible;mso-wrap-style:square;mso-width-percent:950;mso-height-percent:950;mso-wrap-distance-left:9pt;mso-wrap-distance-top:0;mso-wrap-distance-right:9pt;mso-wrap-distance-bottom:0;mso-position-horizontal:center;mso-position-horizontal-relative:page;mso-position-vertical:center;mso-position-vertical-relative:page;mso-width-percent:950;mso-height-percent:950;mso-width-relative:page;mso-height-relative:page;v-text-anchor:middle" o:gfxdata="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" filled="f" strokecolor="#747070 [1614]" strokeweight="1.25pt">
               <w10:wrap anchorx="page" anchory="page"/>
             </v:rect>
           </w:pict>
@@ -6639,7 +6639,7 @@
   <w:rsids>
     <w:rsidRoot w:val="001634C0"/>
     <w:rsid w:val="001634C0"/>
-    <w:rsid w:val="00D62BDF"/>
+    <w:rsid w:val="004D7273"/>
   </w:rsids>
   <m:mathPr>
     <m:mathFont m:val="Cambria Math"/>

</xml_diff>